<commit_message>
fix(tables): include 2021 premature ASMR in manuscript and inline tables
Add female and male 2021 outcomes for 2019 voting only, retain one-page Word layouts, and display both combined tables in the notebook.

Cover coefficients, p-values, sample sizes, and Word table headers with regression tests.
</commit_message>
<xml_diff>
--- a/output/tables/correlation_and_p_value_tables.docx
+++ b/output/tables/correlation_and_p_value_tables.docx
@@ -40,6 +40,19 @@
           <w:sz w:val="10"/>
           <w:szCs w:val="10"/>
         </w:rPr>
+        <w:t xml:space="preserve">Column years denote election years. Premature ASMR (2021) uses deaths registered in 2021 and is compared with 2019 voting only; no 2024 boundary proxy is used.</w:t>
+      </w:r>
+    </w:p>
+    <w:p>
+      <w:pPr>
+        <w:spacing w:after="20" w:line="140" w:lineRule="exact"/>
+      </w:pPr>
+      <w:r>
+        <w:rPr>
+          <w:rFonts w:ascii="Arial Narrow" w:hAnsi="Arial Narrow" w:cs="Arial Narrow"/>
+          <w:sz w:val="10"/>
+          <w:szCs w:val="10"/>
+        </w:rPr>
         <w:t xml:space="preserve">Party rows are vote shares except voter turnout; p values &lt;0.001 are shown as &lt;0.001.</w:t>
       </w:r>
     </w:p>
@@ -59,14 +72,16 @@
       <w:tblGrid>
         <w:gridCol w:w="1150"/>
         <w:gridCol w:w="1700"/>
-        <w:gridCol w:w="1700"/>
-        <w:gridCol w:w="1700"/>
-        <w:gridCol w:w="1700"/>
-        <w:gridCol w:w="1700"/>
-        <w:gridCol w:w="1700"/>
-        <w:gridCol w:w="1700"/>
-        <w:gridCol w:w="1700"/>
-        <w:gridCol w:w="1700"/>
+        <w:gridCol w:w="1360"/>
+        <w:gridCol w:w="1360"/>
+        <w:gridCol w:w="1360"/>
+        <w:gridCol w:w="1360"/>
+        <w:gridCol w:w="1360"/>
+        <w:gridCol w:w="1360"/>
+        <w:gridCol w:w="1360"/>
+        <w:gridCol w:w="1360"/>
+        <w:gridCol w:w="1360"/>
+        <w:gridCol w:w="1360"/>
       </w:tblGrid>
       <w:tr>
         <w:trPr>
@@ -126,7 +141,7 @@
         </w:tc>
         <w:tc>
           <w:tcPr>
-            <w:tcW w:w="3400" w:type="dxa"/>
+            <w:tcW w:w="2720" w:type="dxa"/>
             <w:gridSpan w:val="2"/>
             <w:tcMar>
               <w:top w:w="20" w:type="dxa"/>
@@ -153,7 +168,7 @@
         </w:tc>
         <w:tc>
           <w:tcPr>
-            <w:tcW w:w="3400" w:type="dxa"/>
+            <w:tcW w:w="2720" w:type="dxa"/>
             <w:gridSpan w:val="2"/>
             <w:tcMar>
               <w:top w:w="20" w:type="dxa"/>
@@ -180,8 +195,8 @@
         </w:tc>
         <w:tc>
           <w:tcPr>
-            <w:tcW w:w="3400" w:type="dxa"/>
-            <w:gridSpan w:val="2"/>
+            <w:tcW w:w="1360" w:type="dxa"/>
+            <w:gridSpan w:val="1"/>
             <w:tcMar>
               <w:top w:w="20" w:type="dxa"/>
               <w:left w:w="20" w:type="dxa"/>
@@ -201,13 +216,67 @@
                 <w:sz w:val="14"/>
                 <w:szCs w:val="14"/>
               </w:rPr>
+              <w:t xml:space="preserve">Premature ASMR (2021), female</w:t>
+            </w:r>
+          </w:p>
+        </w:tc>
+        <w:tc>
+          <w:tcPr>
+            <w:tcW w:w="1360" w:type="dxa"/>
+            <w:gridSpan w:val="1"/>
+            <w:tcMar>
+              <w:top w:w="20" w:type="dxa"/>
+              <w:left w:w="20" w:type="dxa"/>
+              <w:bottom w:w="20" w:type="dxa"/>
+              <w:right w:w="20" w:type="dxa"/>
+            </w:tcMar>
+          </w:tcPr>
+          <w:p>
+            <w:pPr>
+              <w:spacing w:after="0" w:line="120" w:lineRule="exact"/>
+            </w:pPr>
+            <w:r>
+              <w:rPr>
+                <w:b/>
+                <w:bCs/>
+                <w:rFonts w:ascii="Arial Narrow" w:hAnsi="Arial Narrow" w:cs="Arial Narrow"/>
+                <w:sz w:val="14"/>
+                <w:szCs w:val="14"/>
+              </w:rPr>
+              <w:t xml:space="preserve">Premature ASMR (2021), male</w:t>
+            </w:r>
+          </w:p>
+        </w:tc>
+        <w:tc>
+          <w:tcPr>
+            <w:tcW w:w="2720" w:type="dxa"/>
+            <w:gridSpan w:val="2"/>
+            <w:tcMar>
+              <w:top w:w="20" w:type="dxa"/>
+              <w:left w:w="20" w:type="dxa"/>
+              <w:bottom w:w="20" w:type="dxa"/>
+              <w:right w:w="20" w:type="dxa"/>
+            </w:tcMar>
+          </w:tcPr>
+          <w:p>
+            <w:pPr>
+              <w:spacing w:after="0" w:line="120" w:lineRule="exact"/>
+            </w:pPr>
+            <w:r>
+              <w:rPr>
+                <w:b/>
+                <w:bCs/>
+                <w:rFonts w:ascii="Arial Narrow" w:hAnsi="Arial Narrow" w:cs="Arial Narrow"/>
+                <w:sz w:val="14"/>
+                <w:szCs w:val="14"/>
+              </w:rPr>
               <w:t xml:space="preserve">Not good health</w:t>
             </w:r>
           </w:p>
         </w:tc>
         <w:tc>
           <w:tcPr>
-            <w:tcW w:w="3400" w:type="dxa"/>
+            <w:tcW w:w="2720" w:type="dxa"/>
             <w:gridSpan w:val="2"/>
             <w:tcMar>
               <w:top w:w="20" w:type="dxa"/>
@@ -287,7 +356,7 @@
         </w:tc>
         <w:tc>
           <w:tcPr>
-            <w:tcW w:w="1700" w:type="dxa"/>
+            <w:tcW w:w="1360" w:type="dxa"/>
             <w:tcMar>
               <w:top w:w="20" w:type="dxa"/>
               <w:left w:w="20" w:type="dxa"/>
@@ -313,7 +382,7 @@
         </w:tc>
         <w:tc>
           <w:tcPr>
-            <w:tcW w:w="1700" w:type="dxa"/>
+            <w:tcW w:w="1360" w:type="dxa"/>
             <w:tcMar>
               <w:top w:w="20" w:type="dxa"/>
               <w:left w:w="20" w:type="dxa"/>
@@ -339,7 +408,7 @@
         </w:tc>
         <w:tc>
           <w:tcPr>
-            <w:tcW w:w="1700" w:type="dxa"/>
+            <w:tcW w:w="1360" w:type="dxa"/>
             <w:tcMar>
               <w:top w:w="20" w:type="dxa"/>
               <w:left w:w="20" w:type="dxa"/>
@@ -365,7 +434,7 @@
         </w:tc>
         <w:tc>
           <w:tcPr>
-            <w:tcW w:w="1700" w:type="dxa"/>
+            <w:tcW w:w="1360" w:type="dxa"/>
             <w:tcMar>
               <w:top w:w="20" w:type="dxa"/>
               <w:left w:w="20" w:type="dxa"/>
@@ -391,7 +460,7 @@
         </w:tc>
         <w:tc>
           <w:tcPr>
-            <w:tcW w:w="1700" w:type="dxa"/>
+            <w:tcW w:w="1360" w:type="dxa"/>
             <w:tcMar>
               <w:top w:w="20" w:type="dxa"/>
               <w:left w:w="20" w:type="dxa"/>
@@ -417,7 +486,7 @@
         </w:tc>
         <w:tc>
           <w:tcPr>
-            <w:tcW w:w="1700" w:type="dxa"/>
+            <w:tcW w:w="1360" w:type="dxa"/>
             <w:tcMar>
               <w:top w:w="20" w:type="dxa"/>
               <w:left w:w="20" w:type="dxa"/>
@@ -437,13 +506,13 @@
                 <w:sz w:val="14"/>
                 <w:szCs w:val="14"/>
               </w:rPr>
-              <w:t xml:space="preserve">2024</w:t>
-            </w:r>
-          </w:p>
-        </w:tc>
-        <w:tc>
-          <w:tcPr>
-            <w:tcW w:w="1700" w:type="dxa"/>
+              <w:t xml:space="preserve">2019</w:t>
+            </w:r>
+          </w:p>
+        </w:tc>
+        <w:tc>
+          <w:tcPr>
+            <w:tcW w:w="1360" w:type="dxa"/>
             <w:tcMar>
               <w:top w:w="20" w:type="dxa"/>
               <w:left w:w="20" w:type="dxa"/>
@@ -469,7 +538,59 @@
         </w:tc>
         <w:tc>
           <w:tcPr>
-            <w:tcW w:w="1700" w:type="dxa"/>
+            <w:tcW w:w="1360" w:type="dxa"/>
+            <w:tcMar>
+              <w:top w:w="20" w:type="dxa"/>
+              <w:left w:w="20" w:type="dxa"/>
+              <w:bottom w:w="20" w:type="dxa"/>
+              <w:right w:w="20" w:type="dxa"/>
+            </w:tcMar>
+          </w:tcPr>
+          <w:p>
+            <w:pPr>
+              <w:spacing w:after="0" w:line="120" w:lineRule="exact"/>
+            </w:pPr>
+            <w:r>
+              <w:rPr>
+                <w:b/>
+                <w:bCs/>
+                <w:rFonts w:ascii="Arial Narrow" w:hAnsi="Arial Narrow" w:cs="Arial Narrow"/>
+                <w:sz w:val="14"/>
+                <w:szCs w:val="14"/>
+              </w:rPr>
+              <w:t xml:space="preserve">2024</w:t>
+            </w:r>
+          </w:p>
+        </w:tc>
+        <w:tc>
+          <w:tcPr>
+            <w:tcW w:w="1360" w:type="dxa"/>
+            <w:tcMar>
+              <w:top w:w="20" w:type="dxa"/>
+              <w:left w:w="20" w:type="dxa"/>
+              <w:bottom w:w="20" w:type="dxa"/>
+              <w:right w:w="20" w:type="dxa"/>
+            </w:tcMar>
+          </w:tcPr>
+          <w:p>
+            <w:pPr>
+              <w:spacing w:after="0" w:line="120" w:lineRule="exact"/>
+            </w:pPr>
+            <w:r>
+              <w:rPr>
+                <w:b/>
+                <w:bCs/>
+                <w:rFonts w:ascii="Arial Narrow" w:hAnsi="Arial Narrow" w:cs="Arial Narrow"/>
+                <w:sz w:val="14"/>
+                <w:szCs w:val="14"/>
+              </w:rPr>
+              <w:t xml:space="preserve">2019</w:t>
+            </w:r>
+          </w:p>
+        </w:tc>
+        <w:tc>
+          <w:tcPr>
+            <w:tcW w:w="1360" w:type="dxa"/>
             <w:tcMar>
               <w:top w:w="20" w:type="dxa"/>
               <w:left w:w="20" w:type="dxa"/>
@@ -548,7 +669,7 @@
         </w:tc>
         <w:tc>
           <w:tcPr>
-            <w:tcW w:w="1700" w:type="dxa"/>
+            <w:tcW w:w="1360" w:type="dxa"/>
             <w:tcMar>
               <w:top w:w="20" w:type="dxa"/>
               <w:left w:w="20" w:type="dxa"/>
@@ -572,7 +693,7 @@
         </w:tc>
         <w:tc>
           <w:tcPr>
-            <w:tcW w:w="1700" w:type="dxa"/>
+            <w:tcW w:w="1360" w:type="dxa"/>
             <w:tcMar>
               <w:top w:w="20" w:type="dxa"/>
               <w:left w:w="20" w:type="dxa"/>
@@ -596,7 +717,7 @@
         </w:tc>
         <w:tc>
           <w:tcPr>
-            <w:tcW w:w="1700" w:type="dxa"/>
+            <w:tcW w:w="1360" w:type="dxa"/>
             <w:tcMar>
               <w:top w:w="20" w:type="dxa"/>
               <w:left w:w="20" w:type="dxa"/>
@@ -620,7 +741,7 @@
         </w:tc>
         <w:tc>
           <w:tcPr>
-            <w:tcW w:w="1700" w:type="dxa"/>
+            <w:tcW w:w="1360" w:type="dxa"/>
             <w:tcMar>
               <w:top w:w="20" w:type="dxa"/>
               <w:left w:w="20" w:type="dxa"/>
@@ -644,7 +765,55 @@
         </w:tc>
         <w:tc>
           <w:tcPr>
-            <w:tcW w:w="1700" w:type="dxa"/>
+            <w:tcW w:w="1360" w:type="dxa"/>
+            <w:tcMar>
+              <w:top w:w="20" w:type="dxa"/>
+              <w:left w:w="20" w:type="dxa"/>
+              <w:bottom w:w="20" w:type="dxa"/>
+              <w:right w:w="20" w:type="dxa"/>
+            </w:tcMar>
+          </w:tcPr>
+          <w:p>
+            <w:pPr>
+              <w:spacing w:after="0" w:line="120" w:lineRule="exact"/>
+            </w:pPr>
+            <w:r>
+              <w:rPr>
+                <w:rFonts w:ascii="Arial Narrow" w:hAnsi="Arial Narrow" w:cs="Arial Narrow"/>
+                <w:sz w:val="14"/>
+                <w:szCs w:val="14"/>
+              </w:rPr>
+              <w:t xml:space="preserve">-0.447 (&lt;0.001)</w:t>
+            </w:r>
+          </w:p>
+        </w:tc>
+        <w:tc>
+          <w:tcPr>
+            <w:tcW w:w="1360" w:type="dxa"/>
+            <w:tcMar>
+              <w:top w:w="20" w:type="dxa"/>
+              <w:left w:w="20" w:type="dxa"/>
+              <w:bottom w:w="20" w:type="dxa"/>
+              <w:right w:w="20" w:type="dxa"/>
+            </w:tcMar>
+          </w:tcPr>
+          <w:p>
+            <w:pPr>
+              <w:spacing w:after="0" w:line="120" w:lineRule="exact"/>
+            </w:pPr>
+            <w:r>
+              <w:rPr>
+                <w:rFonts w:ascii="Arial Narrow" w:hAnsi="Arial Narrow" w:cs="Arial Narrow"/>
+                <w:sz w:val="14"/>
+                <w:szCs w:val="14"/>
+              </w:rPr>
+              <w:t xml:space="preserve">-0.514 (&lt;0.001)</w:t>
+            </w:r>
+          </w:p>
+        </w:tc>
+        <w:tc>
+          <w:tcPr>
+            <w:tcW w:w="1360" w:type="dxa"/>
             <w:tcMar>
               <w:top w:w="20" w:type="dxa"/>
               <w:left w:w="20" w:type="dxa"/>
@@ -668,7 +837,7 @@
         </w:tc>
         <w:tc>
           <w:tcPr>
-            <w:tcW w:w="1700" w:type="dxa"/>
+            <w:tcW w:w="1360" w:type="dxa"/>
             <w:tcMar>
               <w:top w:w="20" w:type="dxa"/>
               <w:left w:w="20" w:type="dxa"/>
@@ -692,7 +861,7 @@
         </w:tc>
         <w:tc>
           <w:tcPr>
-            <w:tcW w:w="1700" w:type="dxa"/>
+            <w:tcW w:w="1360" w:type="dxa"/>
             <w:tcMar>
               <w:top w:w="20" w:type="dxa"/>
               <w:left w:w="20" w:type="dxa"/>
@@ -716,7 +885,7 @@
         </w:tc>
         <w:tc>
           <w:tcPr>
-            <w:tcW w:w="1700" w:type="dxa"/>
+            <w:tcW w:w="1360" w:type="dxa"/>
             <w:tcMar>
               <w:top w:w="20" w:type="dxa"/>
               <w:left w:w="20" w:type="dxa"/>
@@ -793,7 +962,7 @@
         </w:tc>
         <w:tc>
           <w:tcPr>
-            <w:tcW w:w="1700" w:type="dxa"/>
+            <w:tcW w:w="1360" w:type="dxa"/>
             <w:tcMar>
               <w:top w:w="20" w:type="dxa"/>
               <w:left w:w="20" w:type="dxa"/>
@@ -817,7 +986,7 @@
         </w:tc>
         <w:tc>
           <w:tcPr>
-            <w:tcW w:w="1700" w:type="dxa"/>
+            <w:tcW w:w="1360" w:type="dxa"/>
             <w:tcMar>
               <w:top w:w="20" w:type="dxa"/>
               <w:left w:w="20" w:type="dxa"/>
@@ -841,7 +1010,7 @@
         </w:tc>
         <w:tc>
           <w:tcPr>
-            <w:tcW w:w="1700" w:type="dxa"/>
+            <w:tcW w:w="1360" w:type="dxa"/>
             <w:tcMar>
               <w:top w:w="20" w:type="dxa"/>
               <w:left w:w="20" w:type="dxa"/>
@@ -865,7 +1034,7 @@
         </w:tc>
         <w:tc>
           <w:tcPr>
-            <w:tcW w:w="1700" w:type="dxa"/>
+            <w:tcW w:w="1360" w:type="dxa"/>
             <w:tcMar>
               <w:top w:w="20" w:type="dxa"/>
               <w:left w:w="20" w:type="dxa"/>
@@ -889,7 +1058,55 @@
         </w:tc>
         <w:tc>
           <w:tcPr>
-            <w:tcW w:w="1700" w:type="dxa"/>
+            <w:tcW w:w="1360" w:type="dxa"/>
+            <w:tcMar>
+              <w:top w:w="20" w:type="dxa"/>
+              <w:left w:w="20" w:type="dxa"/>
+              <w:bottom w:w="20" w:type="dxa"/>
+              <w:right w:w="20" w:type="dxa"/>
+            </w:tcMar>
+          </w:tcPr>
+          <w:p>
+            <w:pPr>
+              <w:spacing w:after="0" w:line="120" w:lineRule="exact"/>
+            </w:pPr>
+            <w:r>
+              <w:rPr>
+                <w:rFonts w:ascii="Arial Narrow" w:hAnsi="Arial Narrow" w:cs="Arial Narrow"/>
+                <w:sz w:val="14"/>
+                <w:szCs w:val="14"/>
+              </w:rPr>
+              <w:t xml:space="preserve">0.666 (&lt;0.001)</w:t>
+            </w:r>
+          </w:p>
+        </w:tc>
+        <w:tc>
+          <w:tcPr>
+            <w:tcW w:w="1360" w:type="dxa"/>
+            <w:tcMar>
+              <w:top w:w="20" w:type="dxa"/>
+              <w:left w:w="20" w:type="dxa"/>
+              <w:bottom w:w="20" w:type="dxa"/>
+              <w:right w:w="20" w:type="dxa"/>
+            </w:tcMar>
+          </w:tcPr>
+          <w:p>
+            <w:pPr>
+              <w:spacing w:after="0" w:line="120" w:lineRule="exact"/>
+            </w:pPr>
+            <w:r>
+              <w:rPr>
+                <w:rFonts w:ascii="Arial Narrow" w:hAnsi="Arial Narrow" w:cs="Arial Narrow"/>
+                <w:sz w:val="14"/>
+                <w:szCs w:val="14"/>
+              </w:rPr>
+              <w:t xml:space="preserve">0.724 (&lt;0.001)</w:t>
+            </w:r>
+          </w:p>
+        </w:tc>
+        <w:tc>
+          <w:tcPr>
+            <w:tcW w:w="1360" w:type="dxa"/>
             <w:tcMar>
               <w:top w:w="20" w:type="dxa"/>
               <w:left w:w="20" w:type="dxa"/>
@@ -913,7 +1130,7 @@
         </w:tc>
         <w:tc>
           <w:tcPr>
-            <w:tcW w:w="1700" w:type="dxa"/>
+            <w:tcW w:w="1360" w:type="dxa"/>
             <w:tcMar>
               <w:top w:w="20" w:type="dxa"/>
               <w:left w:w="20" w:type="dxa"/>
@@ -937,7 +1154,7 @@
         </w:tc>
         <w:tc>
           <w:tcPr>
-            <w:tcW w:w="1700" w:type="dxa"/>
+            <w:tcW w:w="1360" w:type="dxa"/>
             <w:tcMar>
               <w:top w:w="20" w:type="dxa"/>
               <w:left w:w="20" w:type="dxa"/>
@@ -961,7 +1178,7 @@
         </w:tc>
         <w:tc>
           <w:tcPr>
-            <w:tcW w:w="1700" w:type="dxa"/>
+            <w:tcW w:w="1360" w:type="dxa"/>
             <w:tcMar>
               <w:top w:w="20" w:type="dxa"/>
               <w:left w:w="20" w:type="dxa"/>
@@ -1038,7 +1255,7 @@
         </w:tc>
         <w:tc>
           <w:tcPr>
-            <w:tcW w:w="1700" w:type="dxa"/>
+            <w:tcW w:w="1360" w:type="dxa"/>
             <w:tcMar>
               <w:top w:w="20" w:type="dxa"/>
               <w:left w:w="20" w:type="dxa"/>
@@ -1062,7 +1279,7 @@
         </w:tc>
         <w:tc>
           <w:tcPr>
-            <w:tcW w:w="1700" w:type="dxa"/>
+            <w:tcW w:w="1360" w:type="dxa"/>
             <w:tcMar>
               <w:top w:w="20" w:type="dxa"/>
               <w:left w:w="20" w:type="dxa"/>
@@ -1086,7 +1303,7 @@
         </w:tc>
         <w:tc>
           <w:tcPr>
-            <w:tcW w:w="1700" w:type="dxa"/>
+            <w:tcW w:w="1360" w:type="dxa"/>
             <w:tcMar>
               <w:top w:w="20" w:type="dxa"/>
               <w:left w:w="20" w:type="dxa"/>
@@ -1110,7 +1327,7 @@
         </w:tc>
         <w:tc>
           <w:tcPr>
-            <w:tcW w:w="1700" w:type="dxa"/>
+            <w:tcW w:w="1360" w:type="dxa"/>
             <w:tcMar>
               <w:top w:w="20" w:type="dxa"/>
               <w:left w:w="20" w:type="dxa"/>
@@ -1134,7 +1351,55 @@
         </w:tc>
         <w:tc>
           <w:tcPr>
-            <w:tcW w:w="1700" w:type="dxa"/>
+            <w:tcW w:w="1360" w:type="dxa"/>
+            <w:tcMar>
+              <w:top w:w="20" w:type="dxa"/>
+              <w:left w:w="20" w:type="dxa"/>
+              <w:bottom w:w="20" w:type="dxa"/>
+              <w:right w:w="20" w:type="dxa"/>
+            </w:tcMar>
+          </w:tcPr>
+          <w:p>
+            <w:pPr>
+              <w:spacing w:after="0" w:line="120" w:lineRule="exact"/>
+            </w:pPr>
+            <w:r>
+              <w:rPr>
+                <w:rFonts w:ascii="Arial Narrow" w:hAnsi="Arial Narrow" w:cs="Arial Narrow"/>
+                <w:sz w:val="14"/>
+                <w:szCs w:val="14"/>
+              </w:rPr>
+              <w:t xml:space="preserve">-0.706 (&lt;0.001)</w:t>
+            </w:r>
+          </w:p>
+        </w:tc>
+        <w:tc>
+          <w:tcPr>
+            <w:tcW w:w="1360" w:type="dxa"/>
+            <w:tcMar>
+              <w:top w:w="20" w:type="dxa"/>
+              <w:left w:w="20" w:type="dxa"/>
+              <w:bottom w:w="20" w:type="dxa"/>
+              <w:right w:w="20" w:type="dxa"/>
+            </w:tcMar>
+          </w:tcPr>
+          <w:p>
+            <w:pPr>
+              <w:spacing w:after="0" w:line="120" w:lineRule="exact"/>
+            </w:pPr>
+            <w:r>
+              <w:rPr>
+                <w:rFonts w:ascii="Arial Narrow" w:hAnsi="Arial Narrow" w:cs="Arial Narrow"/>
+                <w:sz w:val="14"/>
+                <w:szCs w:val="14"/>
+              </w:rPr>
+              <w:t xml:space="preserve">-0.685 (&lt;0.001)</w:t>
+            </w:r>
+          </w:p>
+        </w:tc>
+        <w:tc>
+          <w:tcPr>
+            <w:tcW w:w="1360" w:type="dxa"/>
             <w:tcMar>
               <w:top w:w="20" w:type="dxa"/>
               <w:left w:w="20" w:type="dxa"/>
@@ -1158,7 +1423,7 @@
         </w:tc>
         <w:tc>
           <w:tcPr>
-            <w:tcW w:w="1700" w:type="dxa"/>
+            <w:tcW w:w="1360" w:type="dxa"/>
             <w:tcMar>
               <w:top w:w="20" w:type="dxa"/>
               <w:left w:w="20" w:type="dxa"/>
@@ -1182,7 +1447,7 @@
         </w:tc>
         <w:tc>
           <w:tcPr>
-            <w:tcW w:w="1700" w:type="dxa"/>
+            <w:tcW w:w="1360" w:type="dxa"/>
             <w:tcMar>
               <w:top w:w="20" w:type="dxa"/>
               <w:left w:w="20" w:type="dxa"/>
@@ -1206,7 +1471,7 @@
         </w:tc>
         <w:tc>
           <w:tcPr>
-            <w:tcW w:w="1700" w:type="dxa"/>
+            <w:tcW w:w="1360" w:type="dxa"/>
             <w:tcMar>
               <w:top w:w="20" w:type="dxa"/>
               <w:left w:w="20" w:type="dxa"/>
@@ -1283,7 +1548,7 @@
         </w:tc>
         <w:tc>
           <w:tcPr>
-            <w:tcW w:w="1700" w:type="dxa"/>
+            <w:tcW w:w="1360" w:type="dxa"/>
             <w:tcMar>
               <w:top w:w="20" w:type="dxa"/>
               <w:left w:w="20" w:type="dxa"/>
@@ -1307,7 +1572,7 @@
         </w:tc>
         <w:tc>
           <w:tcPr>
-            <w:tcW w:w="1700" w:type="dxa"/>
+            <w:tcW w:w="1360" w:type="dxa"/>
             <w:tcMar>
               <w:top w:w="20" w:type="dxa"/>
               <w:left w:w="20" w:type="dxa"/>
@@ -1331,7 +1596,7 @@
         </w:tc>
         <w:tc>
           <w:tcPr>
-            <w:tcW w:w="1700" w:type="dxa"/>
+            <w:tcW w:w="1360" w:type="dxa"/>
             <w:tcMar>
               <w:top w:w="20" w:type="dxa"/>
               <w:left w:w="20" w:type="dxa"/>
@@ -1355,7 +1620,7 @@
         </w:tc>
         <w:tc>
           <w:tcPr>
-            <w:tcW w:w="1700" w:type="dxa"/>
+            <w:tcW w:w="1360" w:type="dxa"/>
             <w:tcMar>
               <w:top w:w="20" w:type="dxa"/>
               <w:left w:w="20" w:type="dxa"/>
@@ -1379,7 +1644,55 @@
         </w:tc>
         <w:tc>
           <w:tcPr>
-            <w:tcW w:w="1700" w:type="dxa"/>
+            <w:tcW w:w="1360" w:type="dxa"/>
+            <w:tcMar>
+              <w:top w:w="20" w:type="dxa"/>
+              <w:left w:w="20" w:type="dxa"/>
+              <w:bottom w:w="20" w:type="dxa"/>
+              <w:right w:w="20" w:type="dxa"/>
+            </w:tcMar>
+          </w:tcPr>
+          <w:p>
+            <w:pPr>
+              <w:spacing w:after="0" w:line="120" w:lineRule="exact"/>
+            </w:pPr>
+            <w:r>
+              <w:rPr>
+                <w:rFonts w:ascii="Arial Narrow" w:hAnsi="Arial Narrow" w:cs="Arial Narrow"/>
+                <w:sz w:val="14"/>
+                <w:szCs w:val="14"/>
+              </w:rPr>
+              <w:t xml:space="preserve">0.639 (&lt;0.001)</w:t>
+            </w:r>
+          </w:p>
+        </w:tc>
+        <w:tc>
+          <w:tcPr>
+            <w:tcW w:w="1360" w:type="dxa"/>
+            <w:tcMar>
+              <w:top w:w="20" w:type="dxa"/>
+              <w:left w:w="20" w:type="dxa"/>
+              <w:bottom w:w="20" w:type="dxa"/>
+              <w:right w:w="20" w:type="dxa"/>
+            </w:tcMar>
+          </w:tcPr>
+          <w:p>
+            <w:pPr>
+              <w:spacing w:after="0" w:line="120" w:lineRule="exact"/>
+            </w:pPr>
+            <w:r>
+              <w:rPr>
+                <w:rFonts w:ascii="Arial Narrow" w:hAnsi="Arial Narrow" w:cs="Arial Narrow"/>
+                <w:sz w:val="14"/>
+                <w:szCs w:val="14"/>
+              </w:rPr>
+              <w:t xml:space="preserve">0.644 (&lt;0.001)</w:t>
+            </w:r>
+          </w:p>
+        </w:tc>
+        <w:tc>
+          <w:tcPr>
+            <w:tcW w:w="1360" w:type="dxa"/>
             <w:tcMar>
               <w:top w:w="20" w:type="dxa"/>
               <w:left w:w="20" w:type="dxa"/>
@@ -1403,7 +1716,7 @@
         </w:tc>
         <w:tc>
           <w:tcPr>
-            <w:tcW w:w="1700" w:type="dxa"/>
+            <w:tcW w:w="1360" w:type="dxa"/>
             <w:tcMar>
               <w:top w:w="20" w:type="dxa"/>
               <w:left w:w="20" w:type="dxa"/>
@@ -1427,7 +1740,7 @@
         </w:tc>
         <w:tc>
           <w:tcPr>
-            <w:tcW w:w="1700" w:type="dxa"/>
+            <w:tcW w:w="1360" w:type="dxa"/>
             <w:tcMar>
               <w:top w:w="20" w:type="dxa"/>
               <w:left w:w="20" w:type="dxa"/>
@@ -1451,7 +1764,7 @@
         </w:tc>
         <w:tc>
           <w:tcPr>
-            <w:tcW w:w="1700" w:type="dxa"/>
+            <w:tcW w:w="1360" w:type="dxa"/>
             <w:tcMar>
               <w:top w:w="20" w:type="dxa"/>
               <w:left w:w="20" w:type="dxa"/>
@@ -1528,7 +1841,7 @@
         </w:tc>
         <w:tc>
           <w:tcPr>
-            <w:tcW w:w="1700" w:type="dxa"/>
+            <w:tcW w:w="1360" w:type="dxa"/>
             <w:tcMar>
               <w:top w:w="20" w:type="dxa"/>
               <w:left w:w="20" w:type="dxa"/>
@@ -1552,7 +1865,7 @@
         </w:tc>
         <w:tc>
           <w:tcPr>
-            <w:tcW w:w="1700" w:type="dxa"/>
+            <w:tcW w:w="1360" w:type="dxa"/>
             <w:tcMar>
               <w:top w:w="20" w:type="dxa"/>
               <w:left w:w="20" w:type="dxa"/>
@@ -1576,7 +1889,7 @@
         </w:tc>
         <w:tc>
           <w:tcPr>
-            <w:tcW w:w="1700" w:type="dxa"/>
+            <w:tcW w:w="1360" w:type="dxa"/>
             <w:tcMar>
               <w:top w:w="20" w:type="dxa"/>
               <w:left w:w="20" w:type="dxa"/>
@@ -1600,7 +1913,7 @@
         </w:tc>
         <w:tc>
           <w:tcPr>
-            <w:tcW w:w="1700" w:type="dxa"/>
+            <w:tcW w:w="1360" w:type="dxa"/>
             <w:tcMar>
               <w:top w:w="20" w:type="dxa"/>
               <w:left w:w="20" w:type="dxa"/>
@@ -1624,7 +1937,7 @@
         </w:tc>
         <w:tc>
           <w:tcPr>
-            <w:tcW w:w="1700" w:type="dxa"/>
+            <w:tcW w:w="1360" w:type="dxa"/>
             <w:tcMar>
               <w:top w:w="20" w:type="dxa"/>
               <w:left w:w="20" w:type="dxa"/>
@@ -1648,7 +1961,55 @@
         </w:tc>
         <w:tc>
           <w:tcPr>
-            <w:tcW w:w="1700" w:type="dxa"/>
+            <w:tcW w:w="1360" w:type="dxa"/>
+            <w:tcMar>
+              <w:top w:w="20" w:type="dxa"/>
+              <w:left w:w="20" w:type="dxa"/>
+              <w:bottom w:w="20" w:type="dxa"/>
+              <w:right w:w="20" w:type="dxa"/>
+            </w:tcMar>
+          </w:tcPr>
+          <w:p>
+            <w:pPr>
+              <w:spacing w:after="0" w:line="120" w:lineRule="exact"/>
+            </w:pPr>
+            <w:r>
+              <w:rPr>
+                <w:rFonts w:ascii="Arial Narrow" w:hAnsi="Arial Narrow" w:cs="Arial Narrow"/>
+                <w:sz w:val="14"/>
+                <w:szCs w:val="14"/>
+              </w:rPr>
+              <w:t xml:space="preserve"/>
+            </w:r>
+          </w:p>
+        </w:tc>
+        <w:tc>
+          <w:tcPr>
+            <w:tcW w:w="1360" w:type="dxa"/>
+            <w:tcMar>
+              <w:top w:w="20" w:type="dxa"/>
+              <w:left w:w="20" w:type="dxa"/>
+              <w:bottom w:w="20" w:type="dxa"/>
+              <w:right w:w="20" w:type="dxa"/>
+            </w:tcMar>
+          </w:tcPr>
+          <w:p>
+            <w:pPr>
+              <w:spacing w:after="0" w:line="120" w:lineRule="exact"/>
+            </w:pPr>
+            <w:r>
+              <w:rPr>
+                <w:rFonts w:ascii="Arial Narrow" w:hAnsi="Arial Narrow" w:cs="Arial Narrow"/>
+                <w:sz w:val="14"/>
+                <w:szCs w:val="14"/>
+              </w:rPr>
+              <w:t xml:space="preserve"/>
+            </w:r>
+          </w:p>
+        </w:tc>
+        <w:tc>
+          <w:tcPr>
+            <w:tcW w:w="1360" w:type="dxa"/>
             <w:tcMar>
               <w:top w:w="20" w:type="dxa"/>
               <w:left w:w="20" w:type="dxa"/>
@@ -1672,7 +2033,7 @@
         </w:tc>
         <w:tc>
           <w:tcPr>
-            <w:tcW w:w="1700" w:type="dxa"/>
+            <w:tcW w:w="1360" w:type="dxa"/>
             <w:tcMar>
               <w:top w:w="20" w:type="dxa"/>
               <w:left w:w="20" w:type="dxa"/>
@@ -1696,7 +2057,7 @@
         </w:tc>
         <w:tc>
           <w:tcPr>
-            <w:tcW w:w="1700" w:type="dxa"/>
+            <w:tcW w:w="1360" w:type="dxa"/>
             <w:tcMar>
               <w:top w:w="20" w:type="dxa"/>
               <w:left w:w="20" w:type="dxa"/>
@@ -1773,7 +2134,7 @@
         </w:tc>
         <w:tc>
           <w:tcPr>
-            <w:tcW w:w="1700" w:type="dxa"/>
+            <w:tcW w:w="1360" w:type="dxa"/>
             <w:tcMar>
               <w:top w:w="20" w:type="dxa"/>
               <w:left w:w="20" w:type="dxa"/>
@@ -1797,7 +2158,7 @@
         </w:tc>
         <w:tc>
           <w:tcPr>
-            <w:tcW w:w="1700" w:type="dxa"/>
+            <w:tcW w:w="1360" w:type="dxa"/>
             <w:tcMar>
               <w:top w:w="20" w:type="dxa"/>
               <w:left w:w="20" w:type="dxa"/>
@@ -1821,7 +2182,7 @@
         </w:tc>
         <w:tc>
           <w:tcPr>
-            <w:tcW w:w="1700" w:type="dxa"/>
+            <w:tcW w:w="1360" w:type="dxa"/>
             <w:tcMar>
               <w:top w:w="20" w:type="dxa"/>
               <w:left w:w="20" w:type="dxa"/>
@@ -1845,7 +2206,7 @@
         </w:tc>
         <w:tc>
           <w:tcPr>
-            <w:tcW w:w="1700" w:type="dxa"/>
+            <w:tcW w:w="1360" w:type="dxa"/>
             <w:tcMar>
               <w:top w:w="20" w:type="dxa"/>
               <w:left w:w="20" w:type="dxa"/>
@@ -1869,7 +2230,55 @@
         </w:tc>
         <w:tc>
           <w:tcPr>
-            <w:tcW w:w="1700" w:type="dxa"/>
+            <w:tcW w:w="1360" w:type="dxa"/>
+            <w:tcMar>
+              <w:top w:w="20" w:type="dxa"/>
+              <w:left w:w="20" w:type="dxa"/>
+              <w:bottom w:w="20" w:type="dxa"/>
+              <w:right w:w="20" w:type="dxa"/>
+            </w:tcMar>
+          </w:tcPr>
+          <w:p>
+            <w:pPr>
+              <w:spacing w:after="0" w:line="120" w:lineRule="exact"/>
+            </w:pPr>
+            <w:r>
+              <w:rPr>
+                <w:rFonts w:ascii="Arial Narrow" w:hAnsi="Arial Narrow" w:cs="Arial Narrow"/>
+                <w:sz w:val="14"/>
+                <w:szCs w:val="14"/>
+              </w:rPr>
+              <w:t xml:space="preserve">-0.792 (&lt;0.001)</w:t>
+            </w:r>
+          </w:p>
+        </w:tc>
+        <w:tc>
+          <w:tcPr>
+            <w:tcW w:w="1360" w:type="dxa"/>
+            <w:tcMar>
+              <w:top w:w="20" w:type="dxa"/>
+              <w:left w:w="20" w:type="dxa"/>
+              <w:bottom w:w="20" w:type="dxa"/>
+              <w:right w:w="20" w:type="dxa"/>
+            </w:tcMar>
+          </w:tcPr>
+          <w:p>
+            <w:pPr>
+              <w:spacing w:after="0" w:line="120" w:lineRule="exact"/>
+            </w:pPr>
+            <w:r>
+              <w:rPr>
+                <w:rFonts w:ascii="Arial Narrow" w:hAnsi="Arial Narrow" w:cs="Arial Narrow"/>
+                <w:sz w:val="14"/>
+                <w:szCs w:val="14"/>
+              </w:rPr>
+              <w:t xml:space="preserve">-0.804 (&lt;0.001)</w:t>
+            </w:r>
+          </w:p>
+        </w:tc>
+        <w:tc>
+          <w:tcPr>
+            <w:tcW w:w="1360" w:type="dxa"/>
             <w:tcMar>
               <w:top w:w="20" w:type="dxa"/>
               <w:left w:w="20" w:type="dxa"/>
@@ -1893,7 +2302,7 @@
         </w:tc>
         <w:tc>
           <w:tcPr>
-            <w:tcW w:w="1700" w:type="dxa"/>
+            <w:tcW w:w="1360" w:type="dxa"/>
             <w:tcMar>
               <w:top w:w="20" w:type="dxa"/>
               <w:left w:w="20" w:type="dxa"/>
@@ -1917,7 +2326,7 @@
         </w:tc>
         <w:tc>
           <w:tcPr>
-            <w:tcW w:w="1700" w:type="dxa"/>
+            <w:tcW w:w="1360" w:type="dxa"/>
             <w:tcMar>
               <w:top w:w="20" w:type="dxa"/>
               <w:left w:w="20" w:type="dxa"/>
@@ -1941,7 +2350,7 @@
         </w:tc>
         <w:tc>
           <w:tcPr>
-            <w:tcW w:w="1700" w:type="dxa"/>
+            <w:tcW w:w="1360" w:type="dxa"/>
             <w:tcMar>
               <w:top w:w="20" w:type="dxa"/>
               <w:left w:w="20" w:type="dxa"/>
@@ -2018,7 +2427,7 @@
         </w:tc>
         <w:tc>
           <w:tcPr>
-            <w:tcW w:w="1700" w:type="dxa"/>
+            <w:tcW w:w="1360" w:type="dxa"/>
             <w:tcMar>
               <w:top w:w="20" w:type="dxa"/>
               <w:left w:w="20" w:type="dxa"/>
@@ -2042,7 +2451,7 @@
         </w:tc>
         <w:tc>
           <w:tcPr>
-            <w:tcW w:w="1700" w:type="dxa"/>
+            <w:tcW w:w="1360" w:type="dxa"/>
             <w:tcMar>
               <w:top w:w="20" w:type="dxa"/>
               <w:left w:w="20" w:type="dxa"/>
@@ -2066,7 +2475,7 @@
         </w:tc>
         <w:tc>
           <w:tcPr>
-            <w:tcW w:w="1700" w:type="dxa"/>
+            <w:tcW w:w="1360" w:type="dxa"/>
             <w:tcMar>
               <w:top w:w="20" w:type="dxa"/>
               <w:left w:w="20" w:type="dxa"/>
@@ -2090,7 +2499,7 @@
         </w:tc>
         <w:tc>
           <w:tcPr>
-            <w:tcW w:w="1700" w:type="dxa"/>
+            <w:tcW w:w="1360" w:type="dxa"/>
             <w:tcMar>
               <w:top w:w="20" w:type="dxa"/>
               <w:left w:w="20" w:type="dxa"/>
@@ -2114,7 +2523,55 @@
         </w:tc>
         <w:tc>
           <w:tcPr>
-            <w:tcW w:w="1700" w:type="dxa"/>
+            <w:tcW w:w="1360" w:type="dxa"/>
+            <w:tcMar>
+              <w:top w:w="20" w:type="dxa"/>
+              <w:left w:w="20" w:type="dxa"/>
+              <w:bottom w:w="20" w:type="dxa"/>
+              <w:right w:w="20" w:type="dxa"/>
+            </w:tcMar>
+          </w:tcPr>
+          <w:p>
+            <w:pPr>
+              <w:spacing w:after="0" w:line="120" w:lineRule="exact"/>
+            </w:pPr>
+            <w:r>
+              <w:rPr>
+                <w:rFonts w:ascii="Arial Narrow" w:hAnsi="Arial Narrow" w:cs="Arial Narrow"/>
+                <w:sz w:val="14"/>
+                <w:szCs w:val="14"/>
+              </w:rPr>
+              <w:t xml:space="preserve">-0.489 (&lt;0.001)</w:t>
+            </w:r>
+          </w:p>
+        </w:tc>
+        <w:tc>
+          <w:tcPr>
+            <w:tcW w:w="1360" w:type="dxa"/>
+            <w:tcMar>
+              <w:top w:w="20" w:type="dxa"/>
+              <w:left w:w="20" w:type="dxa"/>
+              <w:bottom w:w="20" w:type="dxa"/>
+              <w:right w:w="20" w:type="dxa"/>
+            </w:tcMar>
+          </w:tcPr>
+          <w:p>
+            <w:pPr>
+              <w:spacing w:after="0" w:line="120" w:lineRule="exact"/>
+            </w:pPr>
+            <w:r>
+              <w:rPr>
+                <w:rFonts w:ascii="Arial Narrow" w:hAnsi="Arial Narrow" w:cs="Arial Narrow"/>
+                <w:sz w:val="14"/>
+                <w:szCs w:val="14"/>
+              </w:rPr>
+              <w:t xml:space="preserve">-0.545 (&lt;0.001)</w:t>
+            </w:r>
+          </w:p>
+        </w:tc>
+        <w:tc>
+          <w:tcPr>
+            <w:tcW w:w="1360" w:type="dxa"/>
             <w:tcMar>
               <w:top w:w="20" w:type="dxa"/>
               <w:left w:w="20" w:type="dxa"/>
@@ -2138,7 +2595,7 @@
         </w:tc>
         <w:tc>
           <w:tcPr>
-            <w:tcW w:w="1700" w:type="dxa"/>
+            <w:tcW w:w="1360" w:type="dxa"/>
             <w:tcMar>
               <w:top w:w="20" w:type="dxa"/>
               <w:left w:w="20" w:type="dxa"/>
@@ -2162,7 +2619,7 @@
         </w:tc>
         <w:tc>
           <w:tcPr>
-            <w:tcW w:w="1700" w:type="dxa"/>
+            <w:tcW w:w="1360" w:type="dxa"/>
             <w:tcMar>
               <w:top w:w="20" w:type="dxa"/>
               <w:left w:w="20" w:type="dxa"/>
@@ -2186,7 +2643,7 @@
         </w:tc>
         <w:tc>
           <w:tcPr>
-            <w:tcW w:w="1700" w:type="dxa"/>
+            <w:tcW w:w="1360" w:type="dxa"/>
             <w:tcMar>
               <w:top w:w="20" w:type="dxa"/>
               <w:left w:w="20" w:type="dxa"/>
@@ -2263,7 +2720,7 @@
         </w:tc>
         <w:tc>
           <w:tcPr>
-            <w:tcW w:w="1700" w:type="dxa"/>
+            <w:tcW w:w="1360" w:type="dxa"/>
             <w:tcMar>
               <w:top w:w="20" w:type="dxa"/>
               <w:left w:w="20" w:type="dxa"/>
@@ -2287,7 +2744,7 @@
         </w:tc>
         <w:tc>
           <w:tcPr>
-            <w:tcW w:w="1700" w:type="dxa"/>
+            <w:tcW w:w="1360" w:type="dxa"/>
             <w:tcMar>
               <w:top w:w="20" w:type="dxa"/>
               <w:left w:w="20" w:type="dxa"/>
@@ -2311,7 +2768,7 @@
         </w:tc>
         <w:tc>
           <w:tcPr>
-            <w:tcW w:w="1700" w:type="dxa"/>
+            <w:tcW w:w="1360" w:type="dxa"/>
             <w:tcMar>
               <w:top w:w="20" w:type="dxa"/>
               <w:left w:w="20" w:type="dxa"/>
@@ -2335,7 +2792,7 @@
         </w:tc>
         <w:tc>
           <w:tcPr>
-            <w:tcW w:w="1700" w:type="dxa"/>
+            <w:tcW w:w="1360" w:type="dxa"/>
             <w:tcMar>
               <w:top w:w="20" w:type="dxa"/>
               <w:left w:w="20" w:type="dxa"/>
@@ -2359,7 +2816,55 @@
         </w:tc>
         <w:tc>
           <w:tcPr>
-            <w:tcW w:w="1700" w:type="dxa"/>
+            <w:tcW w:w="1360" w:type="dxa"/>
+            <w:tcMar>
+              <w:top w:w="20" w:type="dxa"/>
+              <w:left w:w="20" w:type="dxa"/>
+              <w:bottom w:w="20" w:type="dxa"/>
+              <w:right w:w="20" w:type="dxa"/>
+            </w:tcMar>
+          </w:tcPr>
+          <w:p>
+            <w:pPr>
+              <w:spacing w:after="0" w:line="120" w:lineRule="exact"/>
+            </w:pPr>
+            <w:r>
+              <w:rPr>
+                <w:rFonts w:ascii="Arial Narrow" w:hAnsi="Arial Narrow" w:cs="Arial Narrow"/>
+                <w:sz w:val="14"/>
+                <w:szCs w:val="14"/>
+              </w:rPr>
+              <w:t xml:space="preserve">0.653 (&lt;0.001)</w:t>
+            </w:r>
+          </w:p>
+        </w:tc>
+        <w:tc>
+          <w:tcPr>
+            <w:tcW w:w="1360" w:type="dxa"/>
+            <w:tcMar>
+              <w:top w:w="20" w:type="dxa"/>
+              <w:left w:w="20" w:type="dxa"/>
+              <w:bottom w:w="20" w:type="dxa"/>
+              <w:right w:w="20" w:type="dxa"/>
+            </w:tcMar>
+          </w:tcPr>
+          <w:p>
+            <w:pPr>
+              <w:spacing w:after="0" w:line="120" w:lineRule="exact"/>
+            </w:pPr>
+            <w:r>
+              <w:rPr>
+                <w:rFonts w:ascii="Arial Narrow" w:hAnsi="Arial Narrow" w:cs="Arial Narrow"/>
+                <w:sz w:val="14"/>
+                <w:szCs w:val="14"/>
+              </w:rPr>
+              <w:t xml:space="preserve">0.708 (&lt;0.001)</w:t>
+            </w:r>
+          </w:p>
+        </w:tc>
+        <w:tc>
+          <w:tcPr>
+            <w:tcW w:w="1360" w:type="dxa"/>
             <w:tcMar>
               <w:top w:w="20" w:type="dxa"/>
               <w:left w:w="20" w:type="dxa"/>
@@ -2383,7 +2888,7 @@
         </w:tc>
         <w:tc>
           <w:tcPr>
-            <w:tcW w:w="1700" w:type="dxa"/>
+            <w:tcW w:w="1360" w:type="dxa"/>
             <w:tcMar>
               <w:top w:w="20" w:type="dxa"/>
               <w:left w:w="20" w:type="dxa"/>
@@ -2407,7 +2912,7 @@
         </w:tc>
         <w:tc>
           <w:tcPr>
-            <w:tcW w:w="1700" w:type="dxa"/>
+            <w:tcW w:w="1360" w:type="dxa"/>
             <w:tcMar>
               <w:top w:w="20" w:type="dxa"/>
               <w:left w:w="20" w:type="dxa"/>
@@ -2431,7 +2936,7 @@
         </w:tc>
         <w:tc>
           <w:tcPr>
-            <w:tcW w:w="1700" w:type="dxa"/>
+            <w:tcW w:w="1360" w:type="dxa"/>
             <w:tcMar>
               <w:top w:w="20" w:type="dxa"/>
               <w:left w:w="20" w:type="dxa"/>
@@ -2508,7 +3013,7 @@
         </w:tc>
         <w:tc>
           <w:tcPr>
-            <w:tcW w:w="1700" w:type="dxa"/>
+            <w:tcW w:w="1360" w:type="dxa"/>
             <w:tcMar>
               <w:top w:w="20" w:type="dxa"/>
               <w:left w:w="20" w:type="dxa"/>
@@ -2532,7 +3037,7 @@
         </w:tc>
         <w:tc>
           <w:tcPr>
-            <w:tcW w:w="1700" w:type="dxa"/>
+            <w:tcW w:w="1360" w:type="dxa"/>
             <w:tcMar>
               <w:top w:w="20" w:type="dxa"/>
               <w:left w:w="20" w:type="dxa"/>
@@ -2556,7 +3061,7 @@
         </w:tc>
         <w:tc>
           <w:tcPr>
-            <w:tcW w:w="1700" w:type="dxa"/>
+            <w:tcW w:w="1360" w:type="dxa"/>
             <w:tcMar>
               <w:top w:w="20" w:type="dxa"/>
               <w:left w:w="20" w:type="dxa"/>
@@ -2580,7 +3085,7 @@
         </w:tc>
         <w:tc>
           <w:tcPr>
-            <w:tcW w:w="1700" w:type="dxa"/>
+            <w:tcW w:w="1360" w:type="dxa"/>
             <w:tcMar>
               <w:top w:w="20" w:type="dxa"/>
               <w:left w:w="20" w:type="dxa"/>
@@ -2604,7 +3109,55 @@
         </w:tc>
         <w:tc>
           <w:tcPr>
-            <w:tcW w:w="1700" w:type="dxa"/>
+            <w:tcW w:w="1360" w:type="dxa"/>
+            <w:tcMar>
+              <w:top w:w="20" w:type="dxa"/>
+              <w:left w:w="20" w:type="dxa"/>
+              <w:bottom w:w="20" w:type="dxa"/>
+              <w:right w:w="20" w:type="dxa"/>
+            </w:tcMar>
+          </w:tcPr>
+          <w:p>
+            <w:pPr>
+              <w:spacing w:after="0" w:line="120" w:lineRule="exact"/>
+            </w:pPr>
+            <w:r>
+              <w:rPr>
+                <w:rFonts w:ascii="Arial Narrow" w:hAnsi="Arial Narrow" w:cs="Arial Narrow"/>
+                <w:sz w:val="14"/>
+                <w:szCs w:val="14"/>
+              </w:rPr>
+              <w:t xml:space="preserve">-0.551 (&lt;0.001)</w:t>
+            </w:r>
+          </w:p>
+        </w:tc>
+        <w:tc>
+          <w:tcPr>
+            <w:tcW w:w="1360" w:type="dxa"/>
+            <w:tcMar>
+              <w:top w:w="20" w:type="dxa"/>
+              <w:left w:w="20" w:type="dxa"/>
+              <w:bottom w:w="20" w:type="dxa"/>
+              <w:right w:w="20" w:type="dxa"/>
+            </w:tcMar>
+          </w:tcPr>
+          <w:p>
+            <w:pPr>
+              <w:spacing w:after="0" w:line="120" w:lineRule="exact"/>
+            </w:pPr>
+            <w:r>
+              <w:rPr>
+                <w:rFonts w:ascii="Arial Narrow" w:hAnsi="Arial Narrow" w:cs="Arial Narrow"/>
+                <w:sz w:val="14"/>
+                <w:szCs w:val="14"/>
+              </w:rPr>
+              <w:t xml:space="preserve">-0.553 (&lt;0.001)</w:t>
+            </w:r>
+          </w:p>
+        </w:tc>
+        <w:tc>
+          <w:tcPr>
+            <w:tcW w:w="1360" w:type="dxa"/>
             <w:tcMar>
               <w:top w:w="20" w:type="dxa"/>
               <w:left w:w="20" w:type="dxa"/>
@@ -2628,7 +3181,7 @@
         </w:tc>
         <w:tc>
           <w:tcPr>
-            <w:tcW w:w="1700" w:type="dxa"/>
+            <w:tcW w:w="1360" w:type="dxa"/>
             <w:tcMar>
               <w:top w:w="20" w:type="dxa"/>
               <w:left w:w="20" w:type="dxa"/>
@@ -2652,7 +3205,7 @@
         </w:tc>
         <w:tc>
           <w:tcPr>
-            <w:tcW w:w="1700" w:type="dxa"/>
+            <w:tcW w:w="1360" w:type="dxa"/>
             <w:tcMar>
               <w:top w:w="20" w:type="dxa"/>
               <w:left w:w="20" w:type="dxa"/>
@@ -2676,7 +3229,7 @@
         </w:tc>
         <w:tc>
           <w:tcPr>
-            <w:tcW w:w="1700" w:type="dxa"/>
+            <w:tcW w:w="1360" w:type="dxa"/>
             <w:tcMar>
               <w:top w:w="20" w:type="dxa"/>
               <w:left w:w="20" w:type="dxa"/>
@@ -2753,7 +3306,7 @@
         </w:tc>
         <w:tc>
           <w:tcPr>
-            <w:tcW w:w="1700" w:type="dxa"/>
+            <w:tcW w:w="1360" w:type="dxa"/>
             <w:tcMar>
               <w:top w:w="20" w:type="dxa"/>
               <w:left w:w="20" w:type="dxa"/>
@@ -2777,7 +3330,7 @@
         </w:tc>
         <w:tc>
           <w:tcPr>
-            <w:tcW w:w="1700" w:type="dxa"/>
+            <w:tcW w:w="1360" w:type="dxa"/>
             <w:tcMar>
               <w:top w:w="20" w:type="dxa"/>
               <w:left w:w="20" w:type="dxa"/>
@@ -2801,7 +3354,7 @@
         </w:tc>
         <w:tc>
           <w:tcPr>
-            <w:tcW w:w="1700" w:type="dxa"/>
+            <w:tcW w:w="1360" w:type="dxa"/>
             <w:tcMar>
               <w:top w:w="20" w:type="dxa"/>
               <w:left w:w="20" w:type="dxa"/>
@@ -2825,7 +3378,7 @@
         </w:tc>
         <w:tc>
           <w:tcPr>
-            <w:tcW w:w="1700" w:type="dxa"/>
+            <w:tcW w:w="1360" w:type="dxa"/>
             <w:tcMar>
               <w:top w:w="20" w:type="dxa"/>
               <w:left w:w="20" w:type="dxa"/>
@@ -2849,7 +3402,55 @@
         </w:tc>
         <w:tc>
           <w:tcPr>
-            <w:tcW w:w="1700" w:type="dxa"/>
+            <w:tcW w:w="1360" w:type="dxa"/>
+            <w:tcMar>
+              <w:top w:w="20" w:type="dxa"/>
+              <w:left w:w="20" w:type="dxa"/>
+              <w:bottom w:w="20" w:type="dxa"/>
+              <w:right w:w="20" w:type="dxa"/>
+            </w:tcMar>
+          </w:tcPr>
+          <w:p>
+            <w:pPr>
+              <w:spacing w:after="0" w:line="120" w:lineRule="exact"/>
+            </w:pPr>
+            <w:r>
+              <w:rPr>
+                <w:rFonts w:ascii="Arial Narrow" w:hAnsi="Arial Narrow" w:cs="Arial Narrow"/>
+                <w:sz w:val="14"/>
+                <w:szCs w:val="14"/>
+              </w:rPr>
+              <w:t xml:space="preserve">0.546 (&lt;0.001)</w:t>
+            </w:r>
+          </w:p>
+        </w:tc>
+        <w:tc>
+          <w:tcPr>
+            <w:tcW w:w="1360" w:type="dxa"/>
+            <w:tcMar>
+              <w:top w:w="20" w:type="dxa"/>
+              <w:left w:w="20" w:type="dxa"/>
+              <w:bottom w:w="20" w:type="dxa"/>
+              <w:right w:w="20" w:type="dxa"/>
+            </w:tcMar>
+          </w:tcPr>
+          <w:p>
+            <w:pPr>
+              <w:spacing w:after="0" w:line="120" w:lineRule="exact"/>
+            </w:pPr>
+            <w:r>
+              <w:rPr>
+                <w:rFonts w:ascii="Arial Narrow" w:hAnsi="Arial Narrow" w:cs="Arial Narrow"/>
+                <w:sz w:val="14"/>
+                <w:szCs w:val="14"/>
+              </w:rPr>
+              <w:t xml:space="preserve">0.490 (&lt;0.001)</w:t>
+            </w:r>
+          </w:p>
+        </w:tc>
+        <w:tc>
+          <w:tcPr>
+            <w:tcW w:w="1360" w:type="dxa"/>
             <w:tcMar>
               <w:top w:w="20" w:type="dxa"/>
               <w:left w:w="20" w:type="dxa"/>
@@ -2873,7 +3474,7 @@
         </w:tc>
         <w:tc>
           <w:tcPr>
-            <w:tcW w:w="1700" w:type="dxa"/>
+            <w:tcW w:w="1360" w:type="dxa"/>
             <w:tcMar>
               <w:top w:w="20" w:type="dxa"/>
               <w:left w:w="20" w:type="dxa"/>
@@ -2897,7 +3498,7 @@
         </w:tc>
         <w:tc>
           <w:tcPr>
-            <w:tcW w:w="1700" w:type="dxa"/>
+            <w:tcW w:w="1360" w:type="dxa"/>
             <w:tcMar>
               <w:top w:w="20" w:type="dxa"/>
               <w:left w:w="20" w:type="dxa"/>
@@ -2921,7 +3522,7 @@
         </w:tc>
         <w:tc>
           <w:tcPr>
-            <w:tcW w:w="1700" w:type="dxa"/>
+            <w:tcW w:w="1360" w:type="dxa"/>
             <w:tcMar>
               <w:top w:w="20" w:type="dxa"/>
               <w:left w:w="20" w:type="dxa"/>
@@ -2998,7 +3599,7 @@
         </w:tc>
         <w:tc>
           <w:tcPr>
-            <w:tcW w:w="1700" w:type="dxa"/>
+            <w:tcW w:w="1360" w:type="dxa"/>
             <w:tcMar>
               <w:top w:w="20" w:type="dxa"/>
               <w:left w:w="20" w:type="dxa"/>
@@ -3022,7 +3623,7 @@
         </w:tc>
         <w:tc>
           <w:tcPr>
-            <w:tcW w:w="1700" w:type="dxa"/>
+            <w:tcW w:w="1360" w:type="dxa"/>
             <w:tcMar>
               <w:top w:w="20" w:type="dxa"/>
               <w:left w:w="20" w:type="dxa"/>
@@ -3046,7 +3647,7 @@
         </w:tc>
         <w:tc>
           <w:tcPr>
-            <w:tcW w:w="1700" w:type="dxa"/>
+            <w:tcW w:w="1360" w:type="dxa"/>
             <w:tcMar>
               <w:top w:w="20" w:type="dxa"/>
               <w:left w:w="20" w:type="dxa"/>
@@ -3070,7 +3671,7 @@
         </w:tc>
         <w:tc>
           <w:tcPr>
-            <w:tcW w:w="1700" w:type="dxa"/>
+            <w:tcW w:w="1360" w:type="dxa"/>
             <w:tcMar>
               <w:top w:w="20" w:type="dxa"/>
               <w:left w:w="20" w:type="dxa"/>
@@ -3094,7 +3695,7 @@
         </w:tc>
         <w:tc>
           <w:tcPr>
-            <w:tcW w:w="1700" w:type="dxa"/>
+            <w:tcW w:w="1360" w:type="dxa"/>
             <w:tcMar>
               <w:top w:w="20" w:type="dxa"/>
               <w:left w:w="20" w:type="dxa"/>
@@ -3118,7 +3719,55 @@
         </w:tc>
         <w:tc>
           <w:tcPr>
-            <w:tcW w:w="1700" w:type="dxa"/>
+            <w:tcW w:w="1360" w:type="dxa"/>
+            <w:tcMar>
+              <w:top w:w="20" w:type="dxa"/>
+              <w:left w:w="20" w:type="dxa"/>
+              <w:bottom w:w="20" w:type="dxa"/>
+              <w:right w:w="20" w:type="dxa"/>
+            </w:tcMar>
+          </w:tcPr>
+          <w:p>
+            <w:pPr>
+              <w:spacing w:after="0" w:line="120" w:lineRule="exact"/>
+            </w:pPr>
+            <w:r>
+              <w:rPr>
+                <w:rFonts w:ascii="Arial Narrow" w:hAnsi="Arial Narrow" w:cs="Arial Narrow"/>
+                <w:sz w:val="14"/>
+                <w:szCs w:val="14"/>
+              </w:rPr>
+              <w:t xml:space="preserve"/>
+            </w:r>
+          </w:p>
+        </w:tc>
+        <w:tc>
+          <w:tcPr>
+            <w:tcW w:w="1360" w:type="dxa"/>
+            <w:tcMar>
+              <w:top w:w="20" w:type="dxa"/>
+              <w:left w:w="20" w:type="dxa"/>
+              <w:bottom w:w="20" w:type="dxa"/>
+              <w:right w:w="20" w:type="dxa"/>
+            </w:tcMar>
+          </w:tcPr>
+          <w:p>
+            <w:pPr>
+              <w:spacing w:after="0" w:line="120" w:lineRule="exact"/>
+            </w:pPr>
+            <w:r>
+              <w:rPr>
+                <w:rFonts w:ascii="Arial Narrow" w:hAnsi="Arial Narrow" w:cs="Arial Narrow"/>
+                <w:sz w:val="14"/>
+                <w:szCs w:val="14"/>
+              </w:rPr>
+              <w:t xml:space="preserve"/>
+            </w:r>
+          </w:p>
+        </w:tc>
+        <w:tc>
+          <w:tcPr>
+            <w:tcW w:w="1360" w:type="dxa"/>
             <w:tcMar>
               <w:top w:w="20" w:type="dxa"/>
               <w:left w:w="20" w:type="dxa"/>
@@ -3142,7 +3791,7 @@
         </w:tc>
         <w:tc>
           <w:tcPr>
-            <w:tcW w:w="1700" w:type="dxa"/>
+            <w:tcW w:w="1360" w:type="dxa"/>
             <w:tcMar>
               <w:top w:w="20" w:type="dxa"/>
               <w:left w:w="20" w:type="dxa"/>
@@ -3166,7 +3815,7 @@
         </w:tc>
         <w:tc>
           <w:tcPr>
-            <w:tcW w:w="1700" w:type="dxa"/>
+            <w:tcW w:w="1360" w:type="dxa"/>
             <w:tcMar>
               <w:top w:w="20" w:type="dxa"/>
               <w:left w:w="20" w:type="dxa"/>
@@ -3243,7 +3892,7 @@
         </w:tc>
         <w:tc>
           <w:tcPr>
-            <w:tcW w:w="1700" w:type="dxa"/>
+            <w:tcW w:w="1360" w:type="dxa"/>
             <w:tcMar>
               <w:top w:w="20" w:type="dxa"/>
               <w:left w:w="20" w:type="dxa"/>
@@ -3267,7 +3916,7 @@
         </w:tc>
         <w:tc>
           <w:tcPr>
-            <w:tcW w:w="1700" w:type="dxa"/>
+            <w:tcW w:w="1360" w:type="dxa"/>
             <w:tcMar>
               <w:top w:w="20" w:type="dxa"/>
               <w:left w:w="20" w:type="dxa"/>
@@ -3291,7 +3940,7 @@
         </w:tc>
         <w:tc>
           <w:tcPr>
-            <w:tcW w:w="1700" w:type="dxa"/>
+            <w:tcW w:w="1360" w:type="dxa"/>
             <w:tcMar>
               <w:top w:w="20" w:type="dxa"/>
               <w:left w:w="20" w:type="dxa"/>
@@ -3315,7 +3964,7 @@
         </w:tc>
         <w:tc>
           <w:tcPr>
-            <w:tcW w:w="1700" w:type="dxa"/>
+            <w:tcW w:w="1360" w:type="dxa"/>
             <w:tcMar>
               <w:top w:w="20" w:type="dxa"/>
               <w:left w:w="20" w:type="dxa"/>
@@ -3339,7 +3988,55 @@
         </w:tc>
         <w:tc>
           <w:tcPr>
-            <w:tcW w:w="1700" w:type="dxa"/>
+            <w:tcW w:w="1360" w:type="dxa"/>
+            <w:tcMar>
+              <w:top w:w="20" w:type="dxa"/>
+              <w:left w:w="20" w:type="dxa"/>
+              <w:bottom w:w="20" w:type="dxa"/>
+              <w:right w:w="20" w:type="dxa"/>
+            </w:tcMar>
+          </w:tcPr>
+          <w:p>
+            <w:pPr>
+              <w:spacing w:after="0" w:line="120" w:lineRule="exact"/>
+            </w:pPr>
+            <w:r>
+              <w:rPr>
+                <w:rFonts w:ascii="Arial Narrow" w:hAnsi="Arial Narrow" w:cs="Arial Narrow"/>
+                <w:sz w:val="14"/>
+                <w:szCs w:val="14"/>
+              </w:rPr>
+              <w:t xml:space="preserve">-0.776 (&lt;0.001)</w:t>
+            </w:r>
+          </w:p>
+        </w:tc>
+        <w:tc>
+          <w:tcPr>
+            <w:tcW w:w="1360" w:type="dxa"/>
+            <w:tcMar>
+              <w:top w:w="20" w:type="dxa"/>
+              <w:left w:w="20" w:type="dxa"/>
+              <w:bottom w:w="20" w:type="dxa"/>
+              <w:right w:w="20" w:type="dxa"/>
+            </w:tcMar>
+          </w:tcPr>
+          <w:p>
+            <w:pPr>
+              <w:spacing w:after="0" w:line="120" w:lineRule="exact"/>
+            </w:pPr>
+            <w:r>
+              <w:rPr>
+                <w:rFonts w:ascii="Arial Narrow" w:hAnsi="Arial Narrow" w:cs="Arial Narrow"/>
+                <w:sz w:val="14"/>
+                <w:szCs w:val="14"/>
+              </w:rPr>
+              <w:t xml:space="preserve">-0.791 (&lt;0.001)</w:t>
+            </w:r>
+          </w:p>
+        </w:tc>
+        <w:tc>
+          <w:tcPr>
+            <w:tcW w:w="1360" w:type="dxa"/>
             <w:tcMar>
               <w:top w:w="20" w:type="dxa"/>
               <w:left w:w="20" w:type="dxa"/>
@@ -3363,7 +4060,7 @@
         </w:tc>
         <w:tc>
           <w:tcPr>
-            <w:tcW w:w="1700" w:type="dxa"/>
+            <w:tcW w:w="1360" w:type="dxa"/>
             <w:tcMar>
               <w:top w:w="20" w:type="dxa"/>
               <w:left w:w="20" w:type="dxa"/>
@@ -3387,7 +4084,7 @@
         </w:tc>
         <w:tc>
           <w:tcPr>
-            <w:tcW w:w="1700" w:type="dxa"/>
+            <w:tcW w:w="1360" w:type="dxa"/>
             <w:tcMar>
               <w:top w:w="20" w:type="dxa"/>
               <w:left w:w="20" w:type="dxa"/>
@@ -3411,7 +4108,7 @@
         </w:tc>
         <w:tc>
           <w:tcPr>
-            <w:tcW w:w="1700" w:type="dxa"/>
+            <w:tcW w:w="1360" w:type="dxa"/>
             <w:tcMar>
               <w:top w:w="20" w:type="dxa"/>
               <w:left w:w="20" w:type="dxa"/>
@@ -3488,7 +4185,7 @@
         </w:tc>
         <w:tc>
           <w:tcPr>
-            <w:tcW w:w="1700" w:type="dxa"/>
+            <w:tcW w:w="1360" w:type="dxa"/>
             <w:tcMar>
               <w:top w:w="20" w:type="dxa"/>
               <w:left w:w="20" w:type="dxa"/>
@@ -3512,7 +4209,7 @@
         </w:tc>
         <w:tc>
           <w:tcPr>
-            <w:tcW w:w="1700" w:type="dxa"/>
+            <w:tcW w:w="1360" w:type="dxa"/>
             <w:tcMar>
               <w:top w:w="20" w:type="dxa"/>
               <w:left w:w="20" w:type="dxa"/>
@@ -3536,7 +4233,7 @@
         </w:tc>
         <w:tc>
           <w:tcPr>
-            <w:tcW w:w="1700" w:type="dxa"/>
+            <w:tcW w:w="1360" w:type="dxa"/>
             <w:tcMar>
               <w:top w:w="20" w:type="dxa"/>
               <w:left w:w="20" w:type="dxa"/>
@@ -3560,7 +4257,7 @@
         </w:tc>
         <w:tc>
           <w:tcPr>
-            <w:tcW w:w="1700" w:type="dxa"/>
+            <w:tcW w:w="1360" w:type="dxa"/>
             <w:tcMar>
               <w:top w:w="20" w:type="dxa"/>
               <w:left w:w="20" w:type="dxa"/>
@@ -3584,7 +4281,7 @@
         </w:tc>
         <w:tc>
           <w:tcPr>
-            <w:tcW w:w="1700" w:type="dxa"/>
+            <w:tcW w:w="1360" w:type="dxa"/>
             <w:tcMar>
               <w:top w:w="20" w:type="dxa"/>
               <w:left w:w="20" w:type="dxa"/>
@@ -3608,7 +4305,55 @@
         </w:tc>
         <w:tc>
           <w:tcPr>
-            <w:tcW w:w="1700" w:type="dxa"/>
+            <w:tcW w:w="1360" w:type="dxa"/>
+            <w:tcMar>
+              <w:top w:w="20" w:type="dxa"/>
+              <w:left w:w="20" w:type="dxa"/>
+              <w:bottom w:w="20" w:type="dxa"/>
+              <w:right w:w="20" w:type="dxa"/>
+            </w:tcMar>
+          </w:tcPr>
+          <w:p>
+            <w:pPr>
+              <w:spacing w:after="0" w:line="120" w:lineRule="exact"/>
+            </w:pPr>
+            <w:r>
+              <w:rPr>
+                <w:rFonts w:ascii="Arial Narrow" w:hAnsi="Arial Narrow" w:cs="Arial Narrow"/>
+                <w:sz w:val="14"/>
+                <w:szCs w:val="14"/>
+              </w:rPr>
+              <w:t xml:space="preserve">532</w:t>
+            </w:r>
+          </w:p>
+        </w:tc>
+        <w:tc>
+          <w:tcPr>
+            <w:tcW w:w="1360" w:type="dxa"/>
+            <w:tcMar>
+              <w:top w:w="20" w:type="dxa"/>
+              <w:left w:w="20" w:type="dxa"/>
+              <w:bottom w:w="20" w:type="dxa"/>
+              <w:right w:w="20" w:type="dxa"/>
+            </w:tcMar>
+          </w:tcPr>
+          <w:p>
+            <w:pPr>
+              <w:spacing w:after="0" w:line="120" w:lineRule="exact"/>
+            </w:pPr>
+            <w:r>
+              <w:rPr>
+                <w:rFonts w:ascii="Arial Narrow" w:hAnsi="Arial Narrow" w:cs="Arial Narrow"/>
+                <w:sz w:val="14"/>
+                <w:szCs w:val="14"/>
+              </w:rPr>
+              <w:t xml:space="preserve">532</w:t>
+            </w:r>
+          </w:p>
+        </w:tc>
+        <w:tc>
+          <w:tcPr>
+            <w:tcW w:w="1360" w:type="dxa"/>
             <w:tcMar>
               <w:top w:w="20" w:type="dxa"/>
               <w:left w:w="20" w:type="dxa"/>
@@ -3632,7 +4377,7 @@
         </w:tc>
         <w:tc>
           <w:tcPr>
-            <w:tcW w:w="1700" w:type="dxa"/>
+            <w:tcW w:w="1360" w:type="dxa"/>
             <w:tcMar>
               <w:top w:w="20" w:type="dxa"/>
               <w:left w:w="20" w:type="dxa"/>
@@ -3656,7 +4401,7 @@
         </w:tc>
         <w:tc>
           <w:tcPr>
-            <w:tcW w:w="1700" w:type="dxa"/>
+            <w:tcW w:w="1360" w:type="dxa"/>
             <w:tcMar>
               <w:top w:w="20" w:type="dxa"/>
               <w:left w:w="20" w:type="dxa"/>

</xml_diff>

<commit_message>
chore(outputs): refresh verified notebook and publication exports
Execute all 36 analysis cells in the pinned environment and regenerate the 12 PDF/SVG/800-dpi PNG figure sets and both Word tables. Verify all coefficients, p-values and sample sizes against unchanged reference hashes, including the historical non-2021 results; all nine robustness CSVs remain byte-identical. Check 38 export messages and 11 notebook links use relative paths.
</commit_message>
<xml_diff>
--- a/output/tables/correlation_and_p_value_tables.docx
+++ b/output/tables/correlation_and_p_value_tables.docx
@@ -14,7 +14,20 @@
           <w:sz w:val="16"/>
           <w:szCs w:val="16"/>
         </w:rPr>
-        <w:t xml:space="preserve">Table 1. Political party by mortality, health and disability</w:t>
+        <w:t xml:space="preserve">Online compact summary. Political party by mortality, health and disability</w:t>
+      </w:r>
+    </w:p>
+    <w:p>
+      <w:pPr>
+        <w:spacing w:after="20" w:line="140" w:lineRule="exact"/>
+      </w:pPr>
+      <w:r>
+        <w:rPr>
+          <w:rFonts w:ascii="Arial Narrow" w:hAnsi="Arial Narrow" w:cs="Arial Narrow"/>
+          <w:sz w:val="10"/>
+          <w:szCs w:val="10"/>
+        </w:rPr>
+        <w:t xml:space="preserve">This optional summary omits unpaid care and deprivation. Main Table 1 is full_correlation_and_p_value_table.docx.</w:t>
       </w:r>
     </w:p>
     <w:p>

</xml_diff>